<commit_message>
Japanese resumes: fit each on one page
Shokumu keirekisho: compact Yu Gothic line spacing, tighter margins and
spacing, three duplicated phrases trimmed (summary handover sentence,
cross-functional item in skills, self-PR communication sentence) - all
evidence retained. Rirekisho: removed the explicit page break before
licenses, compacted rows/padding/line height, shortened the photo
instruction note; history content unchanged.

Co-Authored-By: Claude Fable 5 <noreply@anthropic.com>
</commit_message>
<xml_diff>
--- a/public/resume/rirekisho.docx
+++ b/public/resume/rirekisho.docx
@@ -1,9 +1,10 @@
 
 <file path=word/document.xml><?xml version="1.0" encoding="utf-8"?>
-<w:document xmlns:wpc="http://schemas.microsoft.com/office/word/2010/wordprocessingCanvas" xmlns:mc="http://schemas.openxmlformats.org/markup-compatibility/2006" xmlns:o="urn:schemas-microsoft-com:office:office" xmlns:r="http://schemas.openxmlformats.org/officeDocument/2006/relationships" xmlns:m="http://schemas.openxmlformats.org/officeDocument/2006/math" xmlns:v="urn:schemas-microsoft-com:vml" xmlns:wp14="http://schemas.microsoft.com/office/word/2010/wordprocessingDrawing" xmlns:wp="http://schemas.openxmlformats.org/drawingml/2006/wordprocessingDrawing" xmlns:w10="urn:schemas-microsoft-com:office:word" xmlns:w="http://schemas.openxmlformats.org/wordprocessingml/2006/main" xmlns:w14="http://schemas.microsoft.com/office/word/2010/wordml" xmlns:w15="http://schemas.microsoft.com/office/word/2012/wordml" xmlns:wpg="http://schemas.microsoft.com/office/word/2010/wordprocessingGroup" xmlns:wpi="http://schemas.microsoft.com/office/word/2010/wordprocessingInk" xmlns:wne="http://schemas.microsoft.com/office/word/2006/wordml" xmlns:wps="http://schemas.microsoft.com/office/word/2010/wordprocessingShape" xmlns:cx="http://schemas.microsoft.com/office/drawing/2014/chartex" xmlns:cx1="http://schemas.microsoft.com/office/drawing/2015/9/8/chartex" xmlns:cx2="http://schemas.microsoft.com/office/drawing/2015/10/21/chartex" xmlns:cx3="http://schemas.microsoft.com/office/drawing/2016/5/9/chartex" xmlns:cx4="http://schemas.microsoft.com/office/drawing/2016/5/10/chartex" xmlns:cx5="http://schemas.microsoft.com/office/drawing/2016/5/11/chartex" xmlns:cx6="http://schemas.microsoft.com/office/drawing/2016/5/12/chartex" xmlns:cx7="http://schemas.microsoft.com/office/drawing/2016/5/13/chartex" xmlns:cx8="http://schemas.microsoft.com/office/drawing/2016/5/14/chartex" xmlns:aink="http://schemas.microsoft.com/office/drawing/2016/ink" xmlns:am3d="http://schemas.microsoft.com/office/drawing/2017/model3d" xmlns:w16cex="http://schemas.microsoft.com/office/word/2018/wordml/cex" xmlns:w16cid="http://schemas.microsoft.com/office/word/2016/wordml/cid" xmlns:w16="http://schemas.microsoft.com/office/word/2018/wordml" xmlns:w16sdtdh="http://schemas.microsoft.com/office/word/2020/wordml/sdtdatahash" xmlns:w16se="http://schemas.microsoft.com/office/word/2015/wordml/symex" mc:Ignorable="w14 w15 wp14">
+<w:document xmlns:ns1="http://schemas.openxmlformats.org/markup-compatibility/2006" xmlns:w="http://schemas.openxmlformats.org/wordprocessingml/2006/main" xmlns:w14="http://schemas.microsoft.com/office/word/2010/wordml" xmlns:w15="http://schemas.microsoft.com/office/word/2012/wordml" xmlns:wp14="http://schemas.microsoft.com/office/word/2010/wordprocessingDrawing" ns1:Ignorable="w14 w15 wp14">
   <w:body>
     <w:p>
       <w:pPr>
+        <w:spacing w:line="180" w:lineRule="auto"/>
         <w:jc w:val="left"/>
       </w:pPr>
       <w:r>
@@ -11,15 +12,15 @@
           <w:rFonts w:ascii="Yu Gothic" w:cs="Yu Gothic" w:eastAsia="Yu Gothic" w:hAnsi="Yu Gothic"/>
           <w:b/>
           <w:bCs/>
-          <w:sz w:val="36"/>
-          <w:szCs w:val="36"/>
+          <w:sz w:val="30"/>
+          <w:szCs w:val="30"/>
         </w:rPr>
         <w:t xml:space="preserve">履歴書</w:t>
       </w:r>
     </w:p>
     <w:p>
       <w:pPr>
-        <w:spacing w:after="200"/>
+        <w:spacing w:after="30" w:line="180" w:lineRule="auto"/>
         <w:jc w:val="right"/>
       </w:pPr>
       <w:r>
@@ -50,7 +51,7 @@
       </w:tblGrid>
       <w:tr>
         <w:trPr>
-          <w:trHeight w:val="700" w:hRule="atLeast"/>
+          <w:trHeight w:val="380" w:hRule="atLeast"/>
         </w:trPr>
         <w:tc>
           <w:tcPr>
@@ -62,15 +63,16 @@
               <w:right w:val="single" w:color="000000" w:sz="4"/>
             </w:tcBorders>
             <w:tcMar>
-              <w:top w:type="dxa" w:w="80"/>
-              <w:left w:type="dxa" w:w="120"/>
-              <w:bottom w:type="dxa" w:w="80"/>
-              <w:right w:type="dxa" w:w="120"/>
-            </w:tcMar>
-            <w:vAlign w:val="center"/>
-          </w:tcPr>
-          <w:p>
-            <w:pPr>
+              <w:top w:type="dxa" w:w="20"/>
+              <w:left w:type="dxa" w:w="120"/>
+              <w:bottom w:type="dxa" w:w="20"/>
+              <w:right w:type="dxa" w:w="120"/>
+            </w:tcMar>
+            <w:vAlign w:val="center"/>
+          </w:tcPr>
+          <w:p>
+            <w:pPr>
+              <w:spacing w:line="180" w:lineRule="auto"/>
               <w:jc w:val="left"/>
             </w:pPr>
             <w:r>
@@ -95,15 +97,16 @@
               <w:right w:val="single" w:color="000000" w:sz="4"/>
             </w:tcBorders>
             <w:tcMar>
-              <w:top w:type="dxa" w:w="80"/>
-              <w:left w:type="dxa" w:w="120"/>
-              <w:bottom w:type="dxa" w:w="80"/>
-              <w:right w:type="dxa" w:w="120"/>
-            </w:tcMar>
-            <w:vAlign w:val="center"/>
-          </w:tcPr>
-          <w:p>
-            <w:pPr>
+              <w:top w:type="dxa" w:w="20"/>
+              <w:left w:type="dxa" w:w="120"/>
+              <w:bottom w:type="dxa" w:w="20"/>
+              <w:right w:type="dxa" w:w="120"/>
+            </w:tcMar>
+            <w:vAlign w:val="center"/>
+          </w:tcPr>
+          <w:p>
+            <w:pPr>
+              <w:spacing w:line="180" w:lineRule="auto"/>
               <w:jc w:val="left"/>
             </w:pPr>
             <w:r>
@@ -129,16 +132,16 @@
               <w:right w:val="single" w:color="000000" w:sz="4"/>
             </w:tcBorders>
             <w:tcMar>
-              <w:top w:type="dxa" w:w="80"/>
-              <w:left w:type="dxa" w:w="120"/>
-              <w:bottom w:type="dxa" w:w="80"/>
-              <w:right w:type="dxa" w:w="120"/>
-            </w:tcMar>
-            <w:vAlign w:val="center"/>
-          </w:tcPr>
-          <w:p>
-            <w:pPr>
-              <w:spacing w:before="100"/>
+              <w:top w:type="dxa" w:w="20"/>
+              <w:left w:type="dxa" w:w="120"/>
+              <w:bottom w:type="dxa" w:w="20"/>
+              <w:right w:type="dxa" w:w="120"/>
+            </w:tcMar>
+            <w:vAlign w:val="center"/>
+          </w:tcPr>
+          <w:p>
+            <w:pPr>
+              <w:spacing w:before="40" w:line="180" w:lineRule="auto"/>
               <w:jc w:val="center"/>
             </w:pPr>
             <w:r>
@@ -152,6 +155,7 @@
           </w:p>
           <w:p>
             <w:pPr>
+              <w:spacing w:line="180" w:lineRule="auto"/>
               <w:jc w:val="center"/>
             </w:pPr>
             <w:r>
@@ -165,6 +169,7 @@
           </w:p>
           <w:p>
             <w:pPr>
+              <w:spacing w:line="180" w:lineRule="auto"/>
               <w:jc w:val="center"/>
             </w:pPr>
             <w:r>
@@ -180,7 +185,7 @@
       </w:tr>
       <w:tr>
         <w:trPr>
-          <w:trHeight w:val="700" w:hRule="atLeast"/>
+          <w:trHeight w:val="380" w:hRule="atLeast"/>
         </w:trPr>
         <w:tc>
           <w:tcPr>
@@ -192,15 +197,16 @@
               <w:right w:val="single" w:color="000000" w:sz="4"/>
             </w:tcBorders>
             <w:tcMar>
-              <w:top w:type="dxa" w:w="80"/>
-              <w:left w:type="dxa" w:w="120"/>
-              <w:bottom w:type="dxa" w:w="80"/>
-              <w:right w:type="dxa" w:w="120"/>
-            </w:tcMar>
-            <w:vAlign w:val="center"/>
-          </w:tcPr>
-          <w:p>
-            <w:pPr>
+              <w:top w:type="dxa" w:w="20"/>
+              <w:left w:type="dxa" w:w="120"/>
+              <w:bottom w:type="dxa" w:w="20"/>
+              <w:right w:type="dxa" w:w="120"/>
+            </w:tcMar>
+            <w:vAlign w:val="center"/>
+          </w:tcPr>
+          <w:p>
+            <w:pPr>
+              <w:spacing w:line="180" w:lineRule="auto"/>
               <w:jc w:val="left"/>
             </w:pPr>
             <w:r>
@@ -225,14 +231,17 @@
               <w:right w:val="single" w:color="000000" w:sz="4"/>
             </w:tcBorders>
             <w:tcMar>
-              <w:top w:type="dxa" w:w="80"/>
-              <w:left w:type="dxa" w:w="120"/>
-              <w:bottom w:type="dxa" w:w="80"/>
-              <w:right w:type="dxa" w:w="120"/>
-            </w:tcMar>
-            <w:vAlign w:val="center"/>
-          </w:tcPr>
-          <w:p>
+              <w:top w:type="dxa" w:w="20"/>
+              <w:left w:type="dxa" w:w="120"/>
+              <w:bottom w:type="dxa" w:w="20"/>
+              <w:right w:type="dxa" w:w="120"/>
+            </w:tcMar>
+            <w:vAlign w:val="center"/>
+          </w:tcPr>
+          <w:p>
+            <w:pPr>
+              <w:spacing w:line="180" w:lineRule="auto"/>
+            </w:pPr>
             <w:r>
               <w:rPr>
                 <w:rFonts w:ascii="Yu Gothic" w:cs="Yu Gothic" w:eastAsia="Yu Gothic" w:hAnsi="Yu Gothic"/>
@@ -260,7 +269,7 @@
       </w:tr>
       <w:tr>
         <w:trPr>
-          <w:trHeight w:val="700" w:hRule="atLeast"/>
+          <w:trHeight w:val="380" w:hRule="atLeast"/>
         </w:trPr>
         <w:tc>
           <w:tcPr>
@@ -272,15 +281,16 @@
               <w:right w:val="single" w:color="000000" w:sz="4"/>
             </w:tcBorders>
             <w:tcMar>
-              <w:top w:type="dxa" w:w="80"/>
-              <w:left w:type="dxa" w:w="120"/>
-              <w:bottom w:type="dxa" w:w="80"/>
-              <w:right w:type="dxa" w:w="120"/>
-            </w:tcMar>
-            <w:vAlign w:val="center"/>
-          </w:tcPr>
-          <w:p>
-            <w:pPr>
+              <w:top w:type="dxa" w:w="20"/>
+              <w:left w:type="dxa" w:w="120"/>
+              <w:bottom w:type="dxa" w:w="20"/>
+              <w:right w:type="dxa" w:w="120"/>
+            </w:tcMar>
+            <w:vAlign w:val="center"/>
+          </w:tcPr>
+          <w:p>
+            <w:pPr>
+              <w:spacing w:line="180" w:lineRule="auto"/>
               <w:jc w:val="left"/>
             </w:pPr>
             <w:r>
@@ -305,15 +315,16 @@
               <w:right w:val="single" w:color="000000" w:sz="4"/>
             </w:tcBorders>
             <w:tcMar>
-              <w:top w:type="dxa" w:w="80"/>
-              <w:left w:type="dxa" w:w="120"/>
-              <w:bottom w:type="dxa" w:w="80"/>
-              <w:right w:type="dxa" w:w="120"/>
-            </w:tcMar>
-            <w:vAlign w:val="center"/>
-          </w:tcPr>
-          <w:p>
-            <w:pPr>
+              <w:top w:type="dxa" w:w="20"/>
+              <w:left w:type="dxa" w:w="120"/>
+              <w:bottom w:type="dxa" w:w="20"/>
+              <w:right w:type="dxa" w:w="120"/>
+            </w:tcMar>
+            <w:vAlign w:val="center"/>
+          </w:tcPr>
+          <w:p>
+            <w:pPr>
+              <w:spacing w:line="180" w:lineRule="auto"/>
               <w:jc w:val="left"/>
             </w:pPr>
             <w:r>
@@ -352,15 +363,16 @@
               <w:right w:val="single" w:color="000000" w:sz="4"/>
             </w:tcBorders>
             <w:tcMar>
-              <w:top w:type="dxa" w:w="80"/>
-              <w:left w:type="dxa" w:w="120"/>
-              <w:bottom w:type="dxa" w:w="80"/>
-              <w:right w:type="dxa" w:w="120"/>
-            </w:tcMar>
-            <w:vAlign w:val="center"/>
-          </w:tcPr>
-          <w:p>
-            <w:pPr>
+              <w:top w:type="dxa" w:w="20"/>
+              <w:left w:type="dxa" w:w="120"/>
+              <w:bottom w:type="dxa" w:w="20"/>
+              <w:right w:type="dxa" w:w="120"/>
+            </w:tcMar>
+            <w:vAlign w:val="center"/>
+          </w:tcPr>
+          <w:p>
+            <w:pPr>
+              <w:spacing w:line="180" w:lineRule="auto"/>
               <w:jc w:val="left"/>
             </w:pPr>
             <w:r>
@@ -386,14 +398,17 @@
               <w:right w:val="single" w:color="000000" w:sz="4"/>
             </w:tcBorders>
             <w:tcMar>
-              <w:top w:type="dxa" w:w="80"/>
-              <w:left w:type="dxa" w:w="120"/>
-              <w:bottom w:type="dxa" w:w="80"/>
-              <w:right w:type="dxa" w:w="120"/>
-            </w:tcMar>
-            <w:vAlign w:val="center"/>
-          </w:tcPr>
-          <w:p>
+              <w:top w:type="dxa" w:w="20"/>
+              <w:left w:type="dxa" w:w="120"/>
+              <w:bottom w:type="dxa" w:w="20"/>
+              <w:right w:type="dxa" w:w="120"/>
+            </w:tcMar>
+            <w:vAlign w:val="center"/>
+          </w:tcPr>
+          <w:p>
+            <w:pPr>
+              <w:spacing w:line="180" w:lineRule="auto"/>
+            </w:pPr>
             <w:r>
               <w:rPr>
                 <w:rFonts w:ascii="Yu Gothic" w:cs="Yu Gothic" w:eastAsia="Yu Gothic" w:hAnsi="Yu Gothic"/>
@@ -404,6 +419,9 @@
             </w:r>
           </w:p>
           <w:p>
+            <w:pPr>
+              <w:spacing w:line="180" w:lineRule="auto"/>
+            </w:pPr>
             <w:r>
               <w:rPr>
                 <w:rFonts w:ascii="Yu Gothic" w:cs="Yu Gothic" w:eastAsia="Yu Gothic" w:hAnsi="Yu Gothic"/>
@@ -426,15 +444,16 @@
               <w:right w:val="single" w:color="000000" w:sz="4"/>
             </w:tcBorders>
             <w:tcMar>
-              <w:top w:type="dxa" w:w="80"/>
-              <w:left w:type="dxa" w:w="120"/>
-              <w:bottom w:type="dxa" w:w="80"/>
-              <w:right w:type="dxa" w:w="120"/>
-            </w:tcMar>
-            <w:vAlign w:val="center"/>
-          </w:tcPr>
-          <w:p>
-            <w:pPr>
+              <w:top w:type="dxa" w:w="20"/>
+              <w:left w:type="dxa" w:w="120"/>
+              <w:bottom w:type="dxa" w:w="20"/>
+              <w:right w:type="dxa" w:w="120"/>
+            </w:tcMar>
+            <w:vAlign w:val="center"/>
+          </w:tcPr>
+          <w:p>
+            <w:pPr>
+              <w:spacing w:line="180" w:lineRule="auto"/>
               <w:jc w:val="left"/>
             </w:pPr>
             <w:r>
@@ -460,15 +479,16 @@
               <w:right w:val="single" w:color="000000" w:sz="4"/>
             </w:tcBorders>
             <w:tcMar>
-              <w:top w:type="dxa" w:w="80"/>
-              <w:left w:type="dxa" w:w="120"/>
-              <w:bottom w:type="dxa" w:w="80"/>
-              <w:right w:type="dxa" w:w="120"/>
-            </w:tcMar>
-            <w:vAlign w:val="center"/>
-          </w:tcPr>
-          <w:p>
-            <w:pPr>
+              <w:top w:type="dxa" w:w="20"/>
+              <w:left w:type="dxa" w:w="120"/>
+              <w:bottom w:type="dxa" w:w="20"/>
+              <w:right w:type="dxa" w:w="120"/>
+            </w:tcMar>
+            <w:vAlign w:val="center"/>
+          </w:tcPr>
+          <w:p>
+            <w:pPr>
+              <w:spacing w:line="180" w:lineRule="auto"/>
               <w:jc w:val="left"/>
             </w:pPr>
             <w:r>
@@ -495,15 +515,16 @@
               <w:right w:val="single" w:color="000000" w:sz="4"/>
             </w:tcBorders>
             <w:tcMar>
-              <w:top w:type="dxa" w:w="80"/>
-              <w:left w:type="dxa" w:w="120"/>
-              <w:bottom w:type="dxa" w:w="80"/>
-              <w:right w:type="dxa" w:w="120"/>
-            </w:tcMar>
-            <w:vAlign w:val="center"/>
-          </w:tcPr>
-          <w:p>
-            <w:pPr>
+              <w:top w:type="dxa" w:w="20"/>
+              <w:left w:type="dxa" w:w="120"/>
+              <w:bottom w:type="dxa" w:w="20"/>
+              <w:right w:type="dxa" w:w="120"/>
+            </w:tcMar>
+            <w:vAlign w:val="center"/>
+          </w:tcPr>
+          <w:p>
+            <w:pPr>
+              <w:spacing w:line="180" w:lineRule="auto"/>
               <w:jc w:val="left"/>
             </w:pPr>
             <w:r>
@@ -529,15 +550,16 @@
               <w:right w:val="single" w:color="000000" w:sz="4"/>
             </w:tcBorders>
             <w:tcMar>
-              <w:top w:type="dxa" w:w="80"/>
-              <w:left w:type="dxa" w:w="120"/>
-              <w:bottom w:type="dxa" w:w="80"/>
-              <w:right w:type="dxa" w:w="120"/>
-            </w:tcMar>
-            <w:vAlign w:val="center"/>
-          </w:tcPr>
-          <w:p>
-            <w:pPr>
+              <w:top w:type="dxa" w:w="20"/>
+              <w:left w:type="dxa" w:w="120"/>
+              <w:bottom w:type="dxa" w:w="20"/>
+              <w:right w:type="dxa" w:w="120"/>
+            </w:tcMar>
+            <w:vAlign w:val="center"/>
+          </w:tcPr>
+          <w:p>
+            <w:pPr>
+              <w:spacing w:line="180" w:lineRule="auto"/>
               <w:jc w:val="left"/>
             </w:pPr>
             <w:r>
@@ -556,7 +578,7 @@
     </w:tbl>
     <w:p>
       <w:pPr>
-        <w:spacing w:before="150"/>
+        <w:spacing w:before="60" w:line="180" w:lineRule="auto"/>
       </w:pPr>
       <w:r>
         <w:rPr>
@@ -566,12 +588,12 @@
           <w:sz w:val="16"/>
           <w:szCs w:val="16"/>
         </w:rPr>
-        <w:t xml:space="preserve">※印刷後、上の枠内に証明写真をのり付けしてください（3ヶ月以内に撮影したもの、正面・上半身、白または薄い色の背景）。</w:t>
+        <w:t xml:space="preserve">※印刷後、上の枠内に証明写真（3ヶ月以内撮影・正面上半身）を貼付してください。</w:t>
       </w:r>
     </w:p>
     <w:p>
       <w:pPr>
-        <w:spacing w:after="100" w:before="300"/>
+        <w:spacing w:after="20" w:before="60" w:line="180" w:lineRule="auto"/>
       </w:pPr>
       <w:r>
         <w:rPr>
@@ -613,15 +635,16 @@
             </w:tcBorders>
             <w:shd w:fill="EEEEEE" w:val="clear"/>
             <w:tcMar>
-              <w:top w:type="dxa" w:w="80"/>
-              <w:left w:type="dxa" w:w="120"/>
-              <w:bottom w:type="dxa" w:w="80"/>
-              <w:right w:type="dxa" w:w="120"/>
-            </w:tcMar>
-            <w:vAlign w:val="center"/>
-          </w:tcPr>
-          <w:p>
-            <w:pPr>
+              <w:top w:type="dxa" w:w="20"/>
+              <w:left w:type="dxa" w:w="120"/>
+              <w:bottom w:type="dxa" w:w="20"/>
+              <w:right w:type="dxa" w:w="120"/>
+            </w:tcMar>
+            <w:vAlign w:val="center"/>
+          </w:tcPr>
+          <w:p>
+            <w:pPr>
+              <w:spacing w:line="180" w:lineRule="auto"/>
               <w:jc w:val="center"/>
             </w:pPr>
             <w:r>
@@ -647,15 +670,16 @@
             </w:tcBorders>
             <w:shd w:fill="EEEEEE" w:val="clear"/>
             <w:tcMar>
-              <w:top w:type="dxa" w:w="80"/>
-              <w:left w:type="dxa" w:w="120"/>
-              <w:bottom w:type="dxa" w:w="80"/>
-              <w:right w:type="dxa" w:w="120"/>
-            </w:tcMar>
-            <w:vAlign w:val="center"/>
-          </w:tcPr>
-          <w:p>
-            <w:pPr>
+              <w:top w:type="dxa" w:w="20"/>
+              <w:left w:type="dxa" w:w="120"/>
+              <w:bottom w:type="dxa" w:w="20"/>
+              <w:right w:type="dxa" w:w="120"/>
+            </w:tcMar>
+            <w:vAlign w:val="center"/>
+          </w:tcPr>
+          <w:p>
+            <w:pPr>
+              <w:spacing w:line="180" w:lineRule="auto"/>
               <w:jc w:val="center"/>
             </w:pPr>
             <w:r>
@@ -681,15 +705,16 @@
             </w:tcBorders>
             <w:shd w:fill="EEEEEE" w:val="clear"/>
             <w:tcMar>
-              <w:top w:type="dxa" w:w="80"/>
-              <w:left w:type="dxa" w:w="120"/>
-              <w:bottom w:type="dxa" w:w="80"/>
-              <w:right w:type="dxa" w:w="120"/>
-            </w:tcMar>
-            <w:vAlign w:val="center"/>
-          </w:tcPr>
-          <w:p>
-            <w:pPr>
+              <w:top w:type="dxa" w:w="20"/>
+              <w:left w:type="dxa" w:w="120"/>
+              <w:bottom w:type="dxa" w:w="20"/>
+              <w:right w:type="dxa" w:w="120"/>
+            </w:tcMar>
+            <w:vAlign w:val="center"/>
+          </w:tcPr>
+          <w:p>
+            <w:pPr>
+              <w:spacing w:line="180" w:lineRule="auto"/>
               <w:jc w:val="left"/>
             </w:pPr>
             <w:r>
@@ -716,15 +741,16 @@
               <w:right w:val="single" w:color="000000" w:sz="4"/>
             </w:tcBorders>
             <w:tcMar>
-              <w:top w:type="dxa" w:w="80"/>
-              <w:left w:type="dxa" w:w="120"/>
-              <w:bottom w:type="dxa" w:w="80"/>
-              <w:right w:type="dxa" w:w="120"/>
-            </w:tcMar>
-            <w:vAlign w:val="center"/>
-          </w:tcPr>
-          <w:p>
-            <w:pPr>
+              <w:top w:type="dxa" w:w="20"/>
+              <w:left w:type="dxa" w:w="120"/>
+              <w:bottom w:type="dxa" w:w="20"/>
+              <w:right w:type="dxa" w:w="120"/>
+            </w:tcMar>
+            <w:vAlign w:val="center"/>
+          </w:tcPr>
+          <w:p>
+            <w:pPr>
+              <w:spacing w:line="180" w:lineRule="auto"/>
               <w:jc w:val="center"/>
             </w:pPr>
             <w:r>
@@ -749,15 +775,16 @@
               <w:right w:val="single" w:color="000000" w:sz="4"/>
             </w:tcBorders>
             <w:tcMar>
-              <w:top w:type="dxa" w:w="80"/>
-              <w:left w:type="dxa" w:w="120"/>
-              <w:bottom w:type="dxa" w:w="80"/>
-              <w:right w:type="dxa" w:w="120"/>
-            </w:tcMar>
-            <w:vAlign w:val="center"/>
-          </w:tcPr>
-          <w:p>
-            <w:pPr>
+              <w:top w:type="dxa" w:w="20"/>
+              <w:left w:type="dxa" w:w="120"/>
+              <w:bottom w:type="dxa" w:w="20"/>
+              <w:right w:type="dxa" w:w="120"/>
+            </w:tcMar>
+            <w:vAlign w:val="center"/>
+          </w:tcPr>
+          <w:p>
+            <w:pPr>
+              <w:spacing w:line="180" w:lineRule="auto"/>
               <w:jc w:val="center"/>
             </w:pPr>
             <w:r>
@@ -782,15 +809,16 @@
               <w:right w:val="single" w:color="000000" w:sz="4"/>
             </w:tcBorders>
             <w:tcMar>
-              <w:top w:type="dxa" w:w="80"/>
-              <w:left w:type="dxa" w:w="120"/>
-              <w:bottom w:type="dxa" w:w="80"/>
-              <w:right w:type="dxa" w:w="120"/>
-            </w:tcMar>
-            <w:vAlign w:val="center"/>
-          </w:tcPr>
-          <w:p>
-            <w:pPr>
+              <w:top w:type="dxa" w:w="20"/>
+              <w:left w:type="dxa" w:w="120"/>
+              <w:bottom w:type="dxa" w:w="20"/>
+              <w:right w:type="dxa" w:w="120"/>
+            </w:tcMar>
+            <w:vAlign w:val="center"/>
+          </w:tcPr>
+          <w:p>
+            <w:pPr>
+              <w:spacing w:line="180" w:lineRule="auto"/>
               <w:jc w:val="left"/>
             </w:pPr>
             <w:r>
@@ -817,15 +845,16 @@
               <w:right w:val="single" w:color="000000" w:sz="4"/>
             </w:tcBorders>
             <w:tcMar>
-              <w:top w:type="dxa" w:w="80"/>
-              <w:left w:type="dxa" w:w="120"/>
-              <w:bottom w:type="dxa" w:w="80"/>
-              <w:right w:type="dxa" w:w="120"/>
-            </w:tcMar>
-            <w:vAlign w:val="center"/>
-          </w:tcPr>
-          <w:p>
-            <w:pPr>
+              <w:top w:type="dxa" w:w="20"/>
+              <w:left w:type="dxa" w:w="120"/>
+              <w:bottom w:type="dxa" w:w="20"/>
+              <w:right w:type="dxa" w:w="120"/>
+            </w:tcMar>
+            <w:vAlign w:val="center"/>
+          </w:tcPr>
+          <w:p>
+            <w:pPr>
+              <w:spacing w:line="180" w:lineRule="auto"/>
               <w:jc w:val="center"/>
             </w:pPr>
             <w:r>
@@ -850,15 +879,16 @@
               <w:right w:val="single" w:color="000000" w:sz="4"/>
             </w:tcBorders>
             <w:tcMar>
-              <w:top w:type="dxa" w:w="80"/>
-              <w:left w:type="dxa" w:w="120"/>
-              <w:bottom w:type="dxa" w:w="80"/>
-              <w:right w:type="dxa" w:w="120"/>
-            </w:tcMar>
-            <w:vAlign w:val="center"/>
-          </w:tcPr>
-          <w:p>
-            <w:pPr>
+              <w:top w:type="dxa" w:w="20"/>
+              <w:left w:type="dxa" w:w="120"/>
+              <w:bottom w:type="dxa" w:w="20"/>
+              <w:right w:type="dxa" w:w="120"/>
+            </w:tcMar>
+            <w:vAlign w:val="center"/>
+          </w:tcPr>
+          <w:p>
+            <w:pPr>
+              <w:spacing w:line="180" w:lineRule="auto"/>
               <w:jc w:val="center"/>
             </w:pPr>
             <w:r>
@@ -883,15 +913,16 @@
               <w:right w:val="single" w:color="000000" w:sz="4"/>
             </w:tcBorders>
             <w:tcMar>
-              <w:top w:type="dxa" w:w="80"/>
-              <w:left w:type="dxa" w:w="120"/>
-              <w:bottom w:type="dxa" w:w="80"/>
-              <w:right w:type="dxa" w:w="120"/>
-            </w:tcMar>
-            <w:vAlign w:val="center"/>
-          </w:tcPr>
-          <w:p>
-            <w:pPr>
+              <w:top w:type="dxa" w:w="20"/>
+              <w:left w:type="dxa" w:w="120"/>
+              <w:bottom w:type="dxa" w:w="20"/>
+              <w:right w:type="dxa" w:w="120"/>
+            </w:tcMar>
+            <w:vAlign w:val="center"/>
+          </w:tcPr>
+          <w:p>
+            <w:pPr>
+              <w:spacing w:line="180" w:lineRule="auto"/>
               <w:jc w:val="left"/>
             </w:pPr>
             <w:r>
@@ -918,15 +949,16 @@
               <w:right w:val="single" w:color="000000" w:sz="4"/>
             </w:tcBorders>
             <w:tcMar>
-              <w:top w:type="dxa" w:w="80"/>
-              <w:left w:type="dxa" w:w="120"/>
-              <w:bottom w:type="dxa" w:w="80"/>
-              <w:right w:type="dxa" w:w="120"/>
-            </w:tcMar>
-            <w:vAlign w:val="center"/>
-          </w:tcPr>
-          <w:p>
-            <w:pPr>
+              <w:top w:type="dxa" w:w="20"/>
+              <w:left w:type="dxa" w:w="120"/>
+              <w:bottom w:type="dxa" w:w="20"/>
+              <w:right w:type="dxa" w:w="120"/>
+            </w:tcMar>
+            <w:vAlign w:val="center"/>
+          </w:tcPr>
+          <w:p>
+            <w:pPr>
+              <w:spacing w:line="180" w:lineRule="auto"/>
               <w:jc w:val="center"/>
             </w:pPr>
             <w:r>
@@ -951,15 +983,16 @@
               <w:right w:val="single" w:color="000000" w:sz="4"/>
             </w:tcBorders>
             <w:tcMar>
-              <w:top w:type="dxa" w:w="80"/>
-              <w:left w:type="dxa" w:w="120"/>
-              <w:bottom w:type="dxa" w:w="80"/>
-              <w:right w:type="dxa" w:w="120"/>
-            </w:tcMar>
-            <w:vAlign w:val="center"/>
-          </w:tcPr>
-          <w:p>
-            <w:pPr>
+              <w:top w:type="dxa" w:w="20"/>
+              <w:left w:type="dxa" w:w="120"/>
+              <w:bottom w:type="dxa" w:w="20"/>
+              <w:right w:type="dxa" w:w="120"/>
+            </w:tcMar>
+            <w:vAlign w:val="center"/>
+          </w:tcPr>
+          <w:p>
+            <w:pPr>
+              <w:spacing w:line="180" w:lineRule="auto"/>
               <w:jc w:val="center"/>
             </w:pPr>
             <w:r>
@@ -984,15 +1017,16 @@
               <w:right w:val="single" w:color="000000" w:sz="4"/>
             </w:tcBorders>
             <w:tcMar>
-              <w:top w:type="dxa" w:w="80"/>
-              <w:left w:type="dxa" w:w="120"/>
-              <w:bottom w:type="dxa" w:w="80"/>
-              <w:right w:type="dxa" w:w="120"/>
-            </w:tcMar>
-            <w:vAlign w:val="center"/>
-          </w:tcPr>
-          <w:p>
-            <w:pPr>
+              <w:top w:type="dxa" w:w="20"/>
+              <w:left w:type="dxa" w:w="120"/>
+              <w:bottom w:type="dxa" w:w="20"/>
+              <w:right w:type="dxa" w:w="120"/>
+            </w:tcMar>
+            <w:vAlign w:val="center"/>
+          </w:tcPr>
+          <w:p>
+            <w:pPr>
+              <w:spacing w:line="180" w:lineRule="auto"/>
               <w:jc w:val="left"/>
             </w:pPr>
             <w:r>
@@ -1019,15 +1053,16 @@
               <w:right w:val="single" w:color="000000" w:sz="4"/>
             </w:tcBorders>
             <w:tcMar>
-              <w:top w:type="dxa" w:w="80"/>
-              <w:left w:type="dxa" w:w="120"/>
-              <w:bottom w:type="dxa" w:w="80"/>
-              <w:right w:type="dxa" w:w="120"/>
-            </w:tcMar>
-            <w:vAlign w:val="center"/>
-          </w:tcPr>
-          <w:p>
-            <w:pPr>
+              <w:top w:type="dxa" w:w="20"/>
+              <w:left w:type="dxa" w:w="120"/>
+              <w:bottom w:type="dxa" w:w="20"/>
+              <w:right w:type="dxa" w:w="120"/>
+            </w:tcMar>
+            <w:vAlign w:val="center"/>
+          </w:tcPr>
+          <w:p>
+            <w:pPr>
+              <w:spacing w:line="180" w:lineRule="auto"/>
               <w:jc w:val="center"/>
             </w:pPr>
             <w:r>
@@ -1052,15 +1087,16 @@
               <w:right w:val="single" w:color="000000" w:sz="4"/>
             </w:tcBorders>
             <w:tcMar>
-              <w:top w:type="dxa" w:w="80"/>
-              <w:left w:type="dxa" w:w="120"/>
-              <w:bottom w:type="dxa" w:w="80"/>
-              <w:right w:type="dxa" w:w="120"/>
-            </w:tcMar>
-            <w:vAlign w:val="center"/>
-          </w:tcPr>
-          <w:p>
-            <w:pPr>
+              <w:top w:type="dxa" w:w="20"/>
+              <w:left w:type="dxa" w:w="120"/>
+              <w:bottom w:type="dxa" w:w="20"/>
+              <w:right w:type="dxa" w:w="120"/>
+            </w:tcMar>
+            <w:vAlign w:val="center"/>
+          </w:tcPr>
+          <w:p>
+            <w:pPr>
+              <w:spacing w:line="180" w:lineRule="auto"/>
               <w:jc w:val="center"/>
             </w:pPr>
             <w:r>
@@ -1085,15 +1121,16 @@
               <w:right w:val="single" w:color="000000" w:sz="4"/>
             </w:tcBorders>
             <w:tcMar>
-              <w:top w:type="dxa" w:w="80"/>
-              <w:left w:type="dxa" w:w="120"/>
-              <w:bottom w:type="dxa" w:w="80"/>
-              <w:right w:type="dxa" w:w="120"/>
-            </w:tcMar>
-            <w:vAlign w:val="center"/>
-          </w:tcPr>
-          <w:p>
-            <w:pPr>
+              <w:top w:type="dxa" w:w="20"/>
+              <w:left w:type="dxa" w:w="120"/>
+              <w:bottom w:type="dxa" w:w="20"/>
+              <w:right w:type="dxa" w:w="120"/>
+            </w:tcMar>
+            <w:vAlign w:val="center"/>
+          </w:tcPr>
+          <w:p>
+            <w:pPr>
+              <w:spacing w:line="180" w:lineRule="auto"/>
               <w:jc w:val="left"/>
             </w:pPr>
             <w:r>
@@ -1120,15 +1157,16 @@
               <w:right w:val="single" w:color="000000" w:sz="4"/>
             </w:tcBorders>
             <w:tcMar>
-              <w:top w:type="dxa" w:w="80"/>
-              <w:left w:type="dxa" w:w="120"/>
-              <w:bottom w:type="dxa" w:w="80"/>
-              <w:right w:type="dxa" w:w="120"/>
-            </w:tcMar>
-            <w:vAlign w:val="center"/>
-          </w:tcPr>
-          <w:p>
-            <w:pPr>
+              <w:top w:type="dxa" w:w="20"/>
+              <w:left w:type="dxa" w:w="120"/>
+              <w:bottom w:type="dxa" w:w="20"/>
+              <w:right w:type="dxa" w:w="120"/>
+            </w:tcMar>
+            <w:vAlign w:val="center"/>
+          </w:tcPr>
+          <w:p>
+            <w:pPr>
+              <w:spacing w:line="180" w:lineRule="auto"/>
               <w:jc w:val="center"/>
             </w:pPr>
             <w:r>
@@ -1153,15 +1191,16 @@
               <w:right w:val="single" w:color="000000" w:sz="4"/>
             </w:tcBorders>
             <w:tcMar>
-              <w:top w:type="dxa" w:w="80"/>
-              <w:left w:type="dxa" w:w="120"/>
-              <w:bottom w:type="dxa" w:w="80"/>
-              <w:right w:type="dxa" w:w="120"/>
-            </w:tcMar>
-            <w:vAlign w:val="center"/>
-          </w:tcPr>
-          <w:p>
-            <w:pPr>
+              <w:top w:type="dxa" w:w="20"/>
+              <w:left w:type="dxa" w:w="120"/>
+              <w:bottom w:type="dxa" w:w="20"/>
+              <w:right w:type="dxa" w:w="120"/>
+            </w:tcMar>
+            <w:vAlign w:val="center"/>
+          </w:tcPr>
+          <w:p>
+            <w:pPr>
+              <w:spacing w:line="180" w:lineRule="auto"/>
               <w:jc w:val="center"/>
             </w:pPr>
             <w:r>
@@ -1186,15 +1225,16 @@
               <w:right w:val="single" w:color="000000" w:sz="4"/>
             </w:tcBorders>
             <w:tcMar>
-              <w:top w:type="dxa" w:w="80"/>
-              <w:left w:type="dxa" w:w="120"/>
-              <w:bottom w:type="dxa" w:w="80"/>
-              <w:right w:type="dxa" w:w="120"/>
-            </w:tcMar>
-            <w:vAlign w:val="center"/>
-          </w:tcPr>
-          <w:p>
-            <w:pPr>
+              <w:top w:type="dxa" w:w="20"/>
+              <w:left w:type="dxa" w:w="120"/>
+              <w:bottom w:type="dxa" w:w="20"/>
+              <w:right w:type="dxa" w:w="120"/>
+            </w:tcMar>
+            <w:vAlign w:val="center"/>
+          </w:tcPr>
+          <w:p>
+            <w:pPr>
+              <w:spacing w:line="180" w:lineRule="auto"/>
               <w:jc w:val="left"/>
             </w:pPr>
             <w:r>
@@ -1221,16 +1261,17 @@
               <w:right w:val="single" w:color="000000" w:sz="4"/>
             </w:tcBorders>
             <w:tcMar>
-              <w:top w:type="dxa" w:w="80"/>
-              <w:left w:type="dxa" w:w="120"/>
-              <w:bottom w:type="dxa" w:w="80"/>
-              <w:right w:type="dxa" w:w="120"/>
-            </w:tcMar>
-            <w:vAlign w:val="center"/>
-          </w:tcPr>
-          <w:p>
-            <w:pPr>
-              <w:jc w:val="left"/>
+              <w:top w:type="dxa" w:w="20"/>
+              <w:left w:type="dxa" w:w="120"/>
+              <w:bottom w:type="dxa" w:w="20"/>
+              <w:right w:type="dxa" w:w="120"/>
+            </w:tcMar>
+            <w:vAlign w:val="center"/>
+          </w:tcPr>
+          <w:p>
+            <w:pPr>
+              <w:spacing w:line="180" w:lineRule="auto"/>
+              <w:jc w:val="center"/>
             </w:pPr>
             <w:r>
               <w:rPr>
@@ -1254,16 +1295,17 @@
               <w:right w:val="single" w:color="000000" w:sz="4"/>
             </w:tcBorders>
             <w:tcMar>
-              <w:top w:type="dxa" w:w="80"/>
-              <w:left w:type="dxa" w:w="120"/>
-              <w:bottom w:type="dxa" w:w="80"/>
-              <w:right w:type="dxa" w:w="120"/>
-            </w:tcMar>
-            <w:vAlign w:val="center"/>
-          </w:tcPr>
-          <w:p>
-            <w:pPr>
-              <w:jc w:val="left"/>
+              <w:top w:type="dxa" w:w="20"/>
+              <w:left w:type="dxa" w:w="120"/>
+              <w:bottom w:type="dxa" w:w="20"/>
+              <w:right w:type="dxa" w:w="120"/>
+            </w:tcMar>
+            <w:vAlign w:val="center"/>
+          </w:tcPr>
+          <w:p>
+            <w:pPr>
+              <w:spacing w:line="180" w:lineRule="auto"/>
+              <w:jc w:val="center"/>
             </w:pPr>
             <w:r>
               <w:rPr>
@@ -1287,26 +1329,27 @@
               <w:right w:val="single" w:color="000000" w:sz="4"/>
             </w:tcBorders>
             <w:tcMar>
-              <w:top w:type="dxa" w:w="80"/>
-              <w:left w:type="dxa" w:w="120"/>
-              <w:bottom w:type="dxa" w:w="80"/>
-              <w:right w:type="dxa" w:w="120"/>
-            </w:tcMar>
-            <w:vAlign w:val="center"/>
-          </w:tcPr>
-          <w:p>
-            <w:pPr>
-              <w:jc w:val="left"/>
-            </w:pPr>
-            <w:r>
-              <w:rPr>
-                <w:rFonts w:ascii="Yu Gothic" w:cs="Yu Gothic" w:eastAsia="Yu Gothic" w:hAnsi="Yu Gothic"/>
-                <w:b w:val="false"/>
-                <w:bCs w:val="false"/>
-                <w:sz w:val="21"/>
-                <w:szCs w:val="21"/>
-              </w:rPr>
-              <w:t xml:space="preserve"/>
+              <w:top w:type="dxa" w:w="20"/>
+              <w:left w:type="dxa" w:w="120"/>
+              <w:bottom w:type="dxa" w:w="20"/>
+              <w:right w:type="dxa" w:w="120"/>
+            </w:tcMar>
+            <w:vAlign w:val="center"/>
+          </w:tcPr>
+          <w:p>
+            <w:pPr>
+              <w:spacing w:line="180" w:lineRule="auto"/>
+              <w:jc w:val="left"/>
+            </w:pPr>
+            <w:r>
+              <w:rPr>
+                <w:rFonts w:ascii="Yu Gothic" w:cs="Yu Gothic" w:eastAsia="Yu Gothic" w:hAnsi="Yu Gothic"/>
+                <w:b/>
+                <w:bCs/>
+                <w:sz w:val="21"/>
+                <w:szCs w:val="21"/>
+              </w:rPr>
+              <w:t xml:space="preserve">職歴</w:t>
             </w:r>
           </w:p>
         </w:tc>
@@ -1322,26 +1365,27 @@
               <w:right w:val="single" w:color="000000" w:sz="4"/>
             </w:tcBorders>
             <w:tcMar>
-              <w:top w:type="dxa" w:w="80"/>
-              <w:left w:type="dxa" w:w="120"/>
-              <w:bottom w:type="dxa" w:w="80"/>
-              <w:right w:type="dxa" w:w="120"/>
-            </w:tcMar>
-            <w:vAlign w:val="center"/>
-          </w:tcPr>
-          <w:p>
-            <w:pPr>
-              <w:jc w:val="center"/>
-            </w:pPr>
-            <w:r>
-              <w:rPr>
-                <w:rFonts w:ascii="Yu Gothic" w:cs="Yu Gothic" w:eastAsia="Yu Gothic" w:hAnsi="Yu Gothic"/>
-                <w:b w:val="false"/>
-                <w:bCs w:val="false"/>
-                <w:sz w:val="21"/>
-                <w:szCs w:val="21"/>
-              </w:rPr>
-              <w:t xml:space="preserve"/>
+              <w:top w:type="dxa" w:w="20"/>
+              <w:left w:type="dxa" w:w="120"/>
+              <w:bottom w:type="dxa" w:w="20"/>
+              <w:right w:type="dxa" w:w="120"/>
+            </w:tcMar>
+            <w:vAlign w:val="center"/>
+          </w:tcPr>
+          <w:p>
+            <w:pPr>
+              <w:spacing w:line="180" w:lineRule="auto"/>
+              <w:jc w:val="center"/>
+            </w:pPr>
+            <w:r>
+              <w:rPr>
+                <w:rFonts w:ascii="Yu Gothic" w:cs="Yu Gothic" w:eastAsia="Yu Gothic" w:hAnsi="Yu Gothic"/>
+                <w:b w:val="false"/>
+                <w:bCs w:val="false"/>
+                <w:sz w:val="21"/>
+                <w:szCs w:val="21"/>
+              </w:rPr>
+              <w:t xml:space="preserve">2015</w:t>
             </w:r>
           </w:p>
         </w:tc>
@@ -1355,26 +1399,27 @@
               <w:right w:val="single" w:color="000000" w:sz="4"/>
             </w:tcBorders>
             <w:tcMar>
-              <w:top w:type="dxa" w:w="80"/>
-              <w:left w:type="dxa" w:w="120"/>
-              <w:bottom w:type="dxa" w:w="80"/>
-              <w:right w:type="dxa" w:w="120"/>
-            </w:tcMar>
-            <w:vAlign w:val="center"/>
-          </w:tcPr>
-          <w:p>
-            <w:pPr>
-              <w:jc w:val="center"/>
-            </w:pPr>
-            <w:r>
-              <w:rPr>
-                <w:rFonts w:ascii="Yu Gothic" w:cs="Yu Gothic" w:eastAsia="Yu Gothic" w:hAnsi="Yu Gothic"/>
-                <w:b w:val="false"/>
-                <w:bCs w:val="false"/>
-                <w:sz w:val="21"/>
-                <w:szCs w:val="21"/>
-              </w:rPr>
-              <w:t xml:space="preserve"/>
+              <w:top w:type="dxa" w:w="20"/>
+              <w:left w:type="dxa" w:w="120"/>
+              <w:bottom w:type="dxa" w:w="20"/>
+              <w:right w:type="dxa" w:w="120"/>
+            </w:tcMar>
+            <w:vAlign w:val="center"/>
+          </w:tcPr>
+          <w:p>
+            <w:pPr>
+              <w:spacing w:line="180" w:lineRule="auto"/>
+              <w:jc w:val="center"/>
+            </w:pPr>
+            <w:r>
+              <w:rPr>
+                <w:rFonts w:ascii="Yu Gothic" w:cs="Yu Gothic" w:eastAsia="Yu Gothic" w:hAnsi="Yu Gothic"/>
+                <w:b w:val="false"/>
+                <w:bCs w:val="false"/>
+                <w:sz w:val="21"/>
+                <w:szCs w:val="21"/>
+              </w:rPr>
+              <w:t xml:space="preserve">4</w:t>
             </w:r>
           </w:p>
         </w:tc>
@@ -1388,26 +1433,27 @@
               <w:right w:val="single" w:color="000000" w:sz="4"/>
             </w:tcBorders>
             <w:tcMar>
-              <w:top w:type="dxa" w:w="80"/>
-              <w:left w:type="dxa" w:w="120"/>
-              <w:bottom w:type="dxa" w:w="80"/>
-              <w:right w:type="dxa" w:w="120"/>
-            </w:tcMar>
-            <w:vAlign w:val="center"/>
-          </w:tcPr>
-          <w:p>
-            <w:pPr>
-              <w:jc w:val="left"/>
-            </w:pPr>
-            <w:r>
-              <w:rPr>
-                <w:rFonts w:ascii="Yu Gothic" w:cs="Yu Gothic" w:eastAsia="Yu Gothic" w:hAnsi="Yu Gothic"/>
-                <w:b/>
-                <w:bCs/>
-                <w:sz w:val="21"/>
-                <w:szCs w:val="21"/>
-              </w:rPr>
-              <w:t xml:space="preserve">職歴</w:t>
+              <w:top w:type="dxa" w:w="20"/>
+              <w:left w:type="dxa" w:w="120"/>
+              <w:bottom w:type="dxa" w:w="20"/>
+              <w:right w:type="dxa" w:w="120"/>
+            </w:tcMar>
+            <w:vAlign w:val="center"/>
+          </w:tcPr>
+          <w:p>
+            <w:pPr>
+              <w:spacing w:line="180" w:lineRule="auto"/>
+              <w:jc w:val="left"/>
+            </w:pPr>
+            <w:r>
+              <w:rPr>
+                <w:rFonts w:ascii="Yu Gothic" w:cs="Yu Gothic" w:eastAsia="Yu Gothic" w:hAnsi="Yu Gothic"/>
+                <w:b w:val="false"/>
+                <w:bCs w:val="false"/>
+                <w:sz w:val="21"/>
+                <w:szCs w:val="21"/>
+              </w:rPr>
+              <w:t xml:space="preserve">フランス料理レストラン　入社（シェフ・ド・パルティ）　※個人でゲーム開発（C#／Unity）に取り組みながら勤務</w:t>
             </w:r>
           </w:p>
         </w:tc>
@@ -1423,26 +1469,27 @@
               <w:right w:val="single" w:color="000000" w:sz="4"/>
             </w:tcBorders>
             <w:tcMar>
-              <w:top w:type="dxa" w:w="80"/>
-              <w:left w:type="dxa" w:w="120"/>
-              <w:bottom w:type="dxa" w:w="80"/>
-              <w:right w:type="dxa" w:w="120"/>
-            </w:tcMar>
-            <w:vAlign w:val="center"/>
-          </w:tcPr>
-          <w:p>
-            <w:pPr>
-              <w:jc w:val="center"/>
-            </w:pPr>
-            <w:r>
-              <w:rPr>
-                <w:rFonts w:ascii="Yu Gothic" w:cs="Yu Gothic" w:eastAsia="Yu Gothic" w:hAnsi="Yu Gothic"/>
-                <w:b w:val="false"/>
-                <w:bCs w:val="false"/>
-                <w:sz w:val="21"/>
-                <w:szCs w:val="21"/>
-              </w:rPr>
-              <w:t xml:space="preserve">2015</w:t>
+              <w:top w:type="dxa" w:w="20"/>
+              <w:left w:type="dxa" w:w="120"/>
+              <w:bottom w:type="dxa" w:w="20"/>
+              <w:right w:type="dxa" w:w="120"/>
+            </w:tcMar>
+            <w:vAlign w:val="center"/>
+          </w:tcPr>
+          <w:p>
+            <w:pPr>
+              <w:spacing w:line="180" w:lineRule="auto"/>
+              <w:jc w:val="center"/>
+            </w:pPr>
+            <w:r>
+              <w:rPr>
+                <w:rFonts w:ascii="Yu Gothic" w:cs="Yu Gothic" w:eastAsia="Yu Gothic" w:hAnsi="Yu Gothic"/>
+                <w:b w:val="false"/>
+                <w:bCs w:val="false"/>
+                <w:sz w:val="21"/>
+                <w:szCs w:val="21"/>
+              </w:rPr>
+              <w:t xml:space="preserve">2019</w:t>
             </w:r>
           </w:p>
         </w:tc>
@@ -1456,26 +1503,27 @@
               <w:right w:val="single" w:color="000000" w:sz="4"/>
             </w:tcBorders>
             <w:tcMar>
-              <w:top w:type="dxa" w:w="80"/>
-              <w:left w:type="dxa" w:w="120"/>
-              <w:bottom w:type="dxa" w:w="80"/>
-              <w:right w:type="dxa" w:w="120"/>
-            </w:tcMar>
-            <w:vAlign w:val="center"/>
-          </w:tcPr>
-          <w:p>
-            <w:pPr>
-              <w:jc w:val="center"/>
-            </w:pPr>
-            <w:r>
-              <w:rPr>
-                <w:rFonts w:ascii="Yu Gothic" w:cs="Yu Gothic" w:eastAsia="Yu Gothic" w:hAnsi="Yu Gothic"/>
-                <w:b w:val="false"/>
-                <w:bCs w:val="false"/>
-                <w:sz w:val="21"/>
-                <w:szCs w:val="21"/>
-              </w:rPr>
-              <w:t xml:space="preserve">4</w:t>
+              <w:top w:type="dxa" w:w="20"/>
+              <w:left w:type="dxa" w:w="120"/>
+              <w:bottom w:type="dxa" w:w="20"/>
+              <w:right w:type="dxa" w:w="120"/>
+            </w:tcMar>
+            <w:vAlign w:val="center"/>
+          </w:tcPr>
+          <w:p>
+            <w:pPr>
+              <w:spacing w:line="180" w:lineRule="auto"/>
+              <w:jc w:val="center"/>
+            </w:pPr>
+            <w:r>
+              <w:rPr>
+                <w:rFonts w:ascii="Yu Gothic" w:cs="Yu Gothic" w:eastAsia="Yu Gothic" w:hAnsi="Yu Gothic"/>
+                <w:b w:val="false"/>
+                <w:bCs w:val="false"/>
+                <w:sz w:val="21"/>
+                <w:szCs w:val="21"/>
+              </w:rPr>
+              <w:t xml:space="preserve">6</w:t>
             </w:r>
           </w:p>
         </w:tc>
@@ -1489,26 +1537,27 @@
               <w:right w:val="single" w:color="000000" w:sz="4"/>
             </w:tcBorders>
             <w:tcMar>
-              <w:top w:type="dxa" w:w="80"/>
-              <w:left w:type="dxa" w:w="120"/>
-              <w:bottom w:type="dxa" w:w="80"/>
-              <w:right w:type="dxa" w:w="120"/>
-            </w:tcMar>
-            <w:vAlign w:val="center"/>
-          </w:tcPr>
-          <w:p>
-            <w:pPr>
-              <w:jc w:val="left"/>
-            </w:pPr>
-            <w:r>
-              <w:rPr>
-                <w:rFonts w:ascii="Yu Gothic" w:cs="Yu Gothic" w:eastAsia="Yu Gothic" w:hAnsi="Yu Gothic"/>
-                <w:b w:val="false"/>
-                <w:bCs w:val="false"/>
-                <w:sz w:val="21"/>
-                <w:szCs w:val="21"/>
-              </w:rPr>
-              <w:t xml:space="preserve">フランス料理レストラン　入社（シェフ・ド・パルティ）　※個人でゲーム開発（C#／Unity）に取り組みながら勤務</w:t>
+              <w:top w:type="dxa" w:w="20"/>
+              <w:left w:type="dxa" w:w="120"/>
+              <w:bottom w:type="dxa" w:w="20"/>
+              <w:right w:type="dxa" w:w="120"/>
+            </w:tcMar>
+            <w:vAlign w:val="center"/>
+          </w:tcPr>
+          <w:p>
+            <w:pPr>
+              <w:spacing w:line="180" w:lineRule="auto"/>
+              <w:jc w:val="left"/>
+            </w:pPr>
+            <w:r>
+              <w:rPr>
+                <w:rFonts w:ascii="Yu Gothic" w:cs="Yu Gothic" w:eastAsia="Yu Gothic" w:hAnsi="Yu Gothic"/>
+                <w:b w:val="false"/>
+                <w:bCs w:val="false"/>
+                <w:sz w:val="21"/>
+                <w:szCs w:val="21"/>
+              </w:rPr>
+              <w:t xml:space="preserve">同店勤務を継続しながら、プログラミングブートキャンプ受講開始（Web開発・React・React Native）</w:t>
             </w:r>
           </w:p>
         </w:tc>
@@ -1524,15 +1573,16 @@
               <w:right w:val="single" w:color="000000" w:sz="4"/>
             </w:tcBorders>
             <w:tcMar>
-              <w:top w:type="dxa" w:w="80"/>
-              <w:left w:type="dxa" w:w="120"/>
-              <w:bottom w:type="dxa" w:w="80"/>
-              <w:right w:type="dxa" w:w="120"/>
-            </w:tcMar>
-            <w:vAlign w:val="center"/>
-          </w:tcPr>
-          <w:p>
-            <w:pPr>
+              <w:top w:type="dxa" w:w="20"/>
+              <w:left w:type="dxa" w:w="120"/>
+              <w:bottom w:type="dxa" w:w="20"/>
+              <w:right w:type="dxa" w:w="120"/>
+            </w:tcMar>
+            <w:vAlign w:val="center"/>
+          </w:tcPr>
+          <w:p>
+            <w:pPr>
+              <w:spacing w:line="180" w:lineRule="auto"/>
               <w:jc w:val="center"/>
             </w:pPr>
             <w:r>
@@ -1557,26 +1607,27 @@
               <w:right w:val="single" w:color="000000" w:sz="4"/>
             </w:tcBorders>
             <w:tcMar>
-              <w:top w:type="dxa" w:w="80"/>
-              <w:left w:type="dxa" w:w="120"/>
-              <w:bottom w:type="dxa" w:w="80"/>
-              <w:right w:type="dxa" w:w="120"/>
-            </w:tcMar>
-            <w:vAlign w:val="center"/>
-          </w:tcPr>
-          <w:p>
-            <w:pPr>
-              <w:jc w:val="center"/>
-            </w:pPr>
-            <w:r>
-              <w:rPr>
-                <w:rFonts w:ascii="Yu Gothic" w:cs="Yu Gothic" w:eastAsia="Yu Gothic" w:hAnsi="Yu Gothic"/>
-                <w:b w:val="false"/>
-                <w:bCs w:val="false"/>
-                <w:sz w:val="21"/>
-                <w:szCs w:val="21"/>
-              </w:rPr>
-              <w:t xml:space="preserve">6</w:t>
+              <w:top w:type="dxa" w:w="20"/>
+              <w:left w:type="dxa" w:w="120"/>
+              <w:bottom w:type="dxa" w:w="20"/>
+              <w:right w:type="dxa" w:w="120"/>
+            </w:tcMar>
+            <w:vAlign w:val="center"/>
+          </w:tcPr>
+          <w:p>
+            <w:pPr>
+              <w:spacing w:line="180" w:lineRule="auto"/>
+              <w:jc w:val="center"/>
+            </w:pPr>
+            <w:r>
+              <w:rPr>
+                <w:rFonts w:ascii="Yu Gothic" w:cs="Yu Gothic" w:eastAsia="Yu Gothic" w:hAnsi="Yu Gothic"/>
+                <w:b w:val="false"/>
+                <w:bCs w:val="false"/>
+                <w:sz w:val="21"/>
+                <w:szCs w:val="21"/>
+              </w:rPr>
+              <w:t xml:space="preserve">12</w:t>
             </w:r>
           </w:p>
         </w:tc>
@@ -1590,26 +1641,27 @@
               <w:right w:val="single" w:color="000000" w:sz="4"/>
             </w:tcBorders>
             <w:tcMar>
-              <w:top w:type="dxa" w:w="80"/>
-              <w:left w:type="dxa" w:w="120"/>
-              <w:bottom w:type="dxa" w:w="80"/>
-              <w:right w:type="dxa" w:w="120"/>
-            </w:tcMar>
-            <w:vAlign w:val="center"/>
-          </w:tcPr>
-          <w:p>
-            <w:pPr>
-              <w:jc w:val="left"/>
-            </w:pPr>
-            <w:r>
-              <w:rPr>
-                <w:rFonts w:ascii="Yu Gothic" w:cs="Yu Gothic" w:eastAsia="Yu Gothic" w:hAnsi="Yu Gothic"/>
-                <w:b w:val="false"/>
-                <w:bCs w:val="false"/>
-                <w:sz w:val="21"/>
-                <w:szCs w:val="21"/>
-              </w:rPr>
-              <w:t xml:space="preserve">同店勤務を継続しながら、プログラミングブートキャンプ受講開始（Web開発・React・React Native）</w:t>
+              <w:top w:type="dxa" w:w="20"/>
+              <w:left w:type="dxa" w:w="120"/>
+              <w:bottom w:type="dxa" w:w="20"/>
+              <w:right w:type="dxa" w:w="120"/>
+            </w:tcMar>
+            <w:vAlign w:val="center"/>
+          </w:tcPr>
+          <w:p>
+            <w:pPr>
+              <w:spacing w:line="180" w:lineRule="auto"/>
+              <w:jc w:val="left"/>
+            </w:pPr>
+            <w:r>
+              <w:rPr>
+                <w:rFonts w:ascii="Yu Gothic" w:cs="Yu Gothic" w:eastAsia="Yu Gothic" w:hAnsi="Yu Gothic"/>
+                <w:b w:val="false"/>
+                <w:bCs w:val="false"/>
+                <w:sz w:val="21"/>
+                <w:szCs w:val="21"/>
+              </w:rPr>
+              <w:t xml:space="preserve">同ブートキャンプ修了</w:t>
             </w:r>
           </w:p>
         </w:tc>
@@ -1625,26 +1677,27 @@
               <w:right w:val="single" w:color="000000" w:sz="4"/>
             </w:tcBorders>
             <w:tcMar>
-              <w:top w:type="dxa" w:w="80"/>
-              <w:left w:type="dxa" w:w="120"/>
-              <w:bottom w:type="dxa" w:w="80"/>
-              <w:right w:type="dxa" w:w="120"/>
-            </w:tcMar>
-            <w:vAlign w:val="center"/>
-          </w:tcPr>
-          <w:p>
-            <w:pPr>
-              <w:jc w:val="center"/>
-            </w:pPr>
-            <w:r>
-              <w:rPr>
-                <w:rFonts w:ascii="Yu Gothic" w:cs="Yu Gothic" w:eastAsia="Yu Gothic" w:hAnsi="Yu Gothic"/>
-                <w:b w:val="false"/>
-                <w:bCs w:val="false"/>
-                <w:sz w:val="21"/>
-                <w:szCs w:val="21"/>
-              </w:rPr>
-              <w:t xml:space="preserve">2019</w:t>
+              <w:top w:type="dxa" w:w="20"/>
+              <w:left w:type="dxa" w:w="120"/>
+              <w:bottom w:type="dxa" w:w="20"/>
+              <w:right w:type="dxa" w:w="120"/>
+            </w:tcMar>
+            <w:vAlign w:val="center"/>
+          </w:tcPr>
+          <w:p>
+            <w:pPr>
+              <w:spacing w:line="180" w:lineRule="auto"/>
+              <w:jc w:val="center"/>
+            </w:pPr>
+            <w:r>
+              <w:rPr>
+                <w:rFonts w:ascii="Yu Gothic" w:cs="Yu Gothic" w:eastAsia="Yu Gothic" w:hAnsi="Yu Gothic"/>
+                <w:b w:val="false"/>
+                <w:bCs w:val="false"/>
+                <w:sz w:val="21"/>
+                <w:szCs w:val="21"/>
+              </w:rPr>
+              <w:t xml:space="preserve">2020</w:t>
             </w:r>
           </w:p>
         </w:tc>
@@ -1658,26 +1711,27 @@
               <w:right w:val="single" w:color="000000" w:sz="4"/>
             </w:tcBorders>
             <w:tcMar>
-              <w:top w:type="dxa" w:w="80"/>
-              <w:left w:type="dxa" w:w="120"/>
-              <w:bottom w:type="dxa" w:w="80"/>
-              <w:right w:type="dxa" w:w="120"/>
-            </w:tcMar>
-            <w:vAlign w:val="center"/>
-          </w:tcPr>
-          <w:p>
-            <w:pPr>
-              <w:jc w:val="center"/>
-            </w:pPr>
-            <w:r>
-              <w:rPr>
-                <w:rFonts w:ascii="Yu Gothic" w:cs="Yu Gothic" w:eastAsia="Yu Gothic" w:hAnsi="Yu Gothic"/>
-                <w:b w:val="false"/>
-                <w:bCs w:val="false"/>
-                <w:sz w:val="21"/>
-                <w:szCs w:val="21"/>
-              </w:rPr>
-              <w:t xml:space="preserve">12</w:t>
+              <w:top w:type="dxa" w:w="20"/>
+              <w:left w:type="dxa" w:w="120"/>
+              <w:bottom w:type="dxa" w:w="20"/>
+              <w:right w:type="dxa" w:w="120"/>
+            </w:tcMar>
+            <w:vAlign w:val="center"/>
+          </w:tcPr>
+          <w:p>
+            <w:pPr>
+              <w:spacing w:line="180" w:lineRule="auto"/>
+              <w:jc w:val="center"/>
+            </w:pPr>
+            <w:r>
+              <w:rPr>
+                <w:rFonts w:ascii="Yu Gothic" w:cs="Yu Gothic" w:eastAsia="Yu Gothic" w:hAnsi="Yu Gothic"/>
+                <w:b w:val="false"/>
+                <w:bCs w:val="false"/>
+                <w:sz w:val="21"/>
+                <w:szCs w:val="21"/>
+              </w:rPr>
+              <w:t xml:space="preserve">3</w:t>
             </w:r>
           </w:p>
         </w:tc>
@@ -1691,26 +1745,27 @@
               <w:right w:val="single" w:color="000000" w:sz="4"/>
             </w:tcBorders>
             <w:tcMar>
-              <w:top w:type="dxa" w:w="80"/>
-              <w:left w:type="dxa" w:w="120"/>
-              <w:bottom w:type="dxa" w:w="80"/>
-              <w:right w:type="dxa" w:w="120"/>
-            </w:tcMar>
-            <w:vAlign w:val="center"/>
-          </w:tcPr>
-          <w:p>
-            <w:pPr>
-              <w:jc w:val="left"/>
-            </w:pPr>
-            <w:r>
-              <w:rPr>
-                <w:rFonts w:ascii="Yu Gothic" w:cs="Yu Gothic" w:eastAsia="Yu Gothic" w:hAnsi="Yu Gothic"/>
-                <w:b w:val="false"/>
-                <w:bCs w:val="false"/>
-                <w:sz w:val="21"/>
-                <w:szCs w:val="21"/>
-              </w:rPr>
-              <w:t xml:space="preserve">同ブートキャンプ修了</w:t>
+              <w:top w:type="dxa" w:w="20"/>
+              <w:left w:type="dxa" w:w="120"/>
+              <w:bottom w:type="dxa" w:w="20"/>
+              <w:right w:type="dxa" w:w="120"/>
+            </w:tcMar>
+            <w:vAlign w:val="center"/>
+          </w:tcPr>
+          <w:p>
+            <w:pPr>
+              <w:spacing w:line="180" w:lineRule="auto"/>
+              <w:jc w:val="left"/>
+            </w:pPr>
+            <w:r>
+              <w:rPr>
+                <w:rFonts w:ascii="Yu Gothic" w:cs="Yu Gothic" w:eastAsia="Yu Gothic" w:hAnsi="Yu Gothic"/>
+                <w:b w:val="false"/>
+                <w:bCs w:val="false"/>
+                <w:sz w:val="21"/>
+                <w:szCs w:val="21"/>
+              </w:rPr>
+              <w:t xml:space="preserve">同店退職、Guusto Gifts Inc.（カナダ／リモート・業務委託契約）　フロントエンドエンジニアとして入社</w:t>
             </w:r>
           </w:p>
         </w:tc>
@@ -1726,26 +1781,27 @@
               <w:right w:val="single" w:color="000000" w:sz="4"/>
             </w:tcBorders>
             <w:tcMar>
-              <w:top w:type="dxa" w:w="80"/>
-              <w:left w:type="dxa" w:w="120"/>
-              <w:bottom w:type="dxa" w:w="80"/>
-              <w:right w:type="dxa" w:w="120"/>
-            </w:tcMar>
-            <w:vAlign w:val="center"/>
-          </w:tcPr>
-          <w:p>
-            <w:pPr>
-              <w:jc w:val="center"/>
-            </w:pPr>
-            <w:r>
-              <w:rPr>
-                <w:rFonts w:ascii="Yu Gothic" w:cs="Yu Gothic" w:eastAsia="Yu Gothic" w:hAnsi="Yu Gothic"/>
-                <w:b w:val="false"/>
-                <w:bCs w:val="false"/>
-                <w:sz w:val="21"/>
-                <w:szCs w:val="21"/>
-              </w:rPr>
-              <w:t xml:space="preserve">2020</w:t>
+              <w:top w:type="dxa" w:w="20"/>
+              <w:left w:type="dxa" w:w="120"/>
+              <w:bottom w:type="dxa" w:w="20"/>
+              <w:right w:type="dxa" w:w="120"/>
+            </w:tcMar>
+            <w:vAlign w:val="center"/>
+          </w:tcPr>
+          <w:p>
+            <w:pPr>
+              <w:spacing w:line="180" w:lineRule="auto"/>
+              <w:jc w:val="center"/>
+            </w:pPr>
+            <w:r>
+              <w:rPr>
+                <w:rFonts w:ascii="Yu Gothic" w:cs="Yu Gothic" w:eastAsia="Yu Gothic" w:hAnsi="Yu Gothic"/>
+                <w:b w:val="false"/>
+                <w:bCs w:val="false"/>
+                <w:sz w:val="21"/>
+                <w:szCs w:val="21"/>
+              </w:rPr>
+              <w:t xml:space="preserve">2026</w:t>
             </w:r>
           </w:p>
         </w:tc>
@@ -1759,26 +1815,27 @@
               <w:right w:val="single" w:color="000000" w:sz="4"/>
             </w:tcBorders>
             <w:tcMar>
-              <w:top w:type="dxa" w:w="80"/>
-              <w:left w:type="dxa" w:w="120"/>
-              <w:bottom w:type="dxa" w:w="80"/>
-              <w:right w:type="dxa" w:w="120"/>
-            </w:tcMar>
-            <w:vAlign w:val="center"/>
-          </w:tcPr>
-          <w:p>
-            <w:pPr>
-              <w:jc w:val="center"/>
-            </w:pPr>
-            <w:r>
-              <w:rPr>
-                <w:rFonts w:ascii="Yu Gothic" w:cs="Yu Gothic" w:eastAsia="Yu Gothic" w:hAnsi="Yu Gothic"/>
-                <w:b w:val="false"/>
-                <w:bCs w:val="false"/>
-                <w:sz w:val="21"/>
-                <w:szCs w:val="21"/>
-              </w:rPr>
-              <w:t xml:space="preserve">3</w:t>
+              <w:top w:type="dxa" w:w="20"/>
+              <w:left w:type="dxa" w:w="120"/>
+              <w:bottom w:type="dxa" w:w="20"/>
+              <w:right w:type="dxa" w:w="120"/>
+            </w:tcMar>
+            <w:vAlign w:val="center"/>
+          </w:tcPr>
+          <w:p>
+            <w:pPr>
+              <w:spacing w:line="180" w:lineRule="auto"/>
+              <w:jc w:val="center"/>
+            </w:pPr>
+            <w:r>
+              <w:rPr>
+                <w:rFonts w:ascii="Yu Gothic" w:cs="Yu Gothic" w:eastAsia="Yu Gothic" w:hAnsi="Yu Gothic"/>
+                <w:b w:val="false"/>
+                <w:bCs w:val="false"/>
+                <w:sz w:val="21"/>
+                <w:szCs w:val="21"/>
+              </w:rPr>
+              <w:t xml:space="preserve">7</w:t>
             </w:r>
           </w:p>
         </w:tc>
@@ -1792,26 +1849,27 @@
               <w:right w:val="single" w:color="000000" w:sz="4"/>
             </w:tcBorders>
             <w:tcMar>
-              <w:top w:type="dxa" w:w="80"/>
-              <w:left w:type="dxa" w:w="120"/>
-              <w:bottom w:type="dxa" w:w="80"/>
-              <w:right w:type="dxa" w:w="120"/>
-            </w:tcMar>
-            <w:vAlign w:val="center"/>
-          </w:tcPr>
-          <w:p>
-            <w:pPr>
-              <w:jc w:val="left"/>
-            </w:pPr>
-            <w:r>
-              <w:rPr>
-                <w:rFonts w:ascii="Yu Gothic" w:cs="Yu Gothic" w:eastAsia="Yu Gothic" w:hAnsi="Yu Gothic"/>
-                <w:b w:val="false"/>
-                <w:bCs w:val="false"/>
-                <w:sz w:val="21"/>
-                <w:szCs w:val="21"/>
-              </w:rPr>
-              <w:t xml:space="preserve">同店退職、Guusto Gifts Inc.（カナダ／リモート・業務委託契約）　フロントエンドエンジニアとして入社</w:t>
+              <w:top w:type="dxa" w:w="20"/>
+              <w:left w:type="dxa" w:w="120"/>
+              <w:bottom w:type="dxa" w:w="20"/>
+              <w:right w:type="dxa" w:w="120"/>
+            </w:tcMar>
+            <w:vAlign w:val="center"/>
+          </w:tcPr>
+          <w:p>
+            <w:pPr>
+              <w:spacing w:line="180" w:lineRule="auto"/>
+              <w:jc w:val="left"/>
+            </w:pPr>
+            <w:r>
+              <w:rPr>
+                <w:rFonts w:ascii="Yu Gothic" w:cs="Yu Gothic" w:eastAsia="Yu Gothic" w:hAnsi="Yu Gothic"/>
+                <w:b w:val="false"/>
+                <w:bCs w:val="false"/>
+                <w:sz w:val="21"/>
+                <w:szCs w:val="21"/>
+              </w:rPr>
+              <w:t xml:space="preserve">契約期間満了により退社</w:t>
             </w:r>
           </w:p>
         </w:tc>
@@ -1827,26 +1885,27 @@
               <w:right w:val="single" w:color="000000" w:sz="4"/>
             </w:tcBorders>
             <w:tcMar>
-              <w:top w:type="dxa" w:w="80"/>
-              <w:left w:type="dxa" w:w="120"/>
-              <w:bottom w:type="dxa" w:w="80"/>
-              <w:right w:type="dxa" w:w="120"/>
-            </w:tcMar>
-            <w:vAlign w:val="center"/>
-          </w:tcPr>
-          <w:p>
-            <w:pPr>
-              <w:jc w:val="center"/>
-            </w:pPr>
-            <w:r>
-              <w:rPr>
-                <w:rFonts w:ascii="Yu Gothic" w:cs="Yu Gothic" w:eastAsia="Yu Gothic" w:hAnsi="Yu Gothic"/>
-                <w:b w:val="false"/>
-                <w:bCs w:val="false"/>
-                <w:sz w:val="21"/>
-                <w:szCs w:val="21"/>
-              </w:rPr>
-              <w:t xml:space="preserve">2026</w:t>
+              <w:top w:type="dxa" w:w="20"/>
+              <w:left w:type="dxa" w:w="120"/>
+              <w:bottom w:type="dxa" w:w="20"/>
+              <w:right w:type="dxa" w:w="120"/>
+            </w:tcMar>
+            <w:vAlign w:val="center"/>
+          </w:tcPr>
+          <w:p>
+            <w:pPr>
+              <w:spacing w:line="180" w:lineRule="auto"/>
+              <w:jc w:val="left"/>
+            </w:pPr>
+            <w:r>
+              <w:rPr>
+                <w:rFonts w:ascii="Yu Gothic" w:cs="Yu Gothic" w:eastAsia="Yu Gothic" w:hAnsi="Yu Gothic"/>
+                <w:b w:val="false"/>
+                <w:bCs w:val="false"/>
+                <w:sz w:val="21"/>
+                <w:szCs w:val="21"/>
+              </w:rPr>
+              <w:t xml:space="preserve"/>
             </w:r>
           </w:p>
         </w:tc>
@@ -1860,26 +1919,27 @@
               <w:right w:val="single" w:color="000000" w:sz="4"/>
             </w:tcBorders>
             <w:tcMar>
-              <w:top w:type="dxa" w:w="80"/>
-              <w:left w:type="dxa" w:w="120"/>
-              <w:bottom w:type="dxa" w:w="80"/>
-              <w:right w:type="dxa" w:w="120"/>
-            </w:tcMar>
-            <w:vAlign w:val="center"/>
-          </w:tcPr>
-          <w:p>
-            <w:pPr>
-              <w:jc w:val="center"/>
-            </w:pPr>
-            <w:r>
-              <w:rPr>
-                <w:rFonts w:ascii="Yu Gothic" w:cs="Yu Gothic" w:eastAsia="Yu Gothic" w:hAnsi="Yu Gothic"/>
-                <w:b w:val="false"/>
-                <w:bCs w:val="false"/>
-                <w:sz w:val="21"/>
-                <w:szCs w:val="21"/>
-              </w:rPr>
-              <w:t xml:space="preserve">7</w:t>
+              <w:top w:type="dxa" w:w="20"/>
+              <w:left w:type="dxa" w:w="120"/>
+              <w:bottom w:type="dxa" w:w="20"/>
+              <w:right w:type="dxa" w:w="120"/>
+            </w:tcMar>
+            <w:vAlign w:val="center"/>
+          </w:tcPr>
+          <w:p>
+            <w:pPr>
+              <w:spacing w:line="180" w:lineRule="auto"/>
+              <w:jc w:val="left"/>
+            </w:pPr>
+            <w:r>
+              <w:rPr>
+                <w:rFonts w:ascii="Yu Gothic" w:cs="Yu Gothic" w:eastAsia="Yu Gothic" w:hAnsi="Yu Gothic"/>
+                <w:b w:val="false"/>
+                <w:bCs w:val="false"/>
+                <w:sz w:val="21"/>
+                <w:szCs w:val="21"/>
+              </w:rPr>
+              <w:t xml:space="preserve"/>
             </w:r>
           </w:p>
         </w:tc>
@@ -1893,116 +1953,16 @@
               <w:right w:val="single" w:color="000000" w:sz="4"/>
             </w:tcBorders>
             <w:tcMar>
-              <w:top w:type="dxa" w:w="80"/>
-              <w:left w:type="dxa" w:w="120"/>
-              <w:bottom w:type="dxa" w:w="80"/>
-              <w:right w:type="dxa" w:w="120"/>
-            </w:tcMar>
-            <w:vAlign w:val="center"/>
-          </w:tcPr>
-          <w:p>
-            <w:pPr>
-              <w:jc w:val="left"/>
-            </w:pPr>
-            <w:r>
-              <w:rPr>
-                <w:rFonts w:ascii="Yu Gothic" w:cs="Yu Gothic" w:eastAsia="Yu Gothic" w:hAnsi="Yu Gothic"/>
-                <w:b w:val="false"/>
-                <w:bCs w:val="false"/>
-                <w:sz w:val="21"/>
-                <w:szCs w:val="21"/>
-              </w:rPr>
-              <w:t xml:space="preserve">契約期間満了により退社</w:t>
-            </w:r>
-          </w:p>
-        </w:tc>
-      </w:tr>
-      <w:tr>
-        <w:tc>
-          <w:tcPr>
-            <w:tcW w:type="dxa" w:w="1200"/>
-            <w:tcBorders>
-              <w:top w:val="single" w:color="000000" w:sz="4"/>
-              <w:left w:val="single" w:color="000000" w:sz="4"/>
-              <w:bottom w:val="single" w:color="000000" w:sz="4"/>
-              <w:right w:val="single" w:color="000000" w:sz="4"/>
-            </w:tcBorders>
-            <w:tcMar>
-              <w:top w:type="dxa" w:w="80"/>
-              <w:left w:type="dxa" w:w="120"/>
-              <w:bottom w:type="dxa" w:w="80"/>
-              <w:right w:type="dxa" w:w="120"/>
-            </w:tcMar>
-            <w:vAlign w:val="center"/>
-          </w:tcPr>
-          <w:p>
-            <w:pPr>
-              <w:jc w:val="left"/>
-            </w:pPr>
-            <w:r>
-              <w:rPr>
-                <w:rFonts w:ascii="Yu Gothic" w:cs="Yu Gothic" w:eastAsia="Yu Gothic" w:hAnsi="Yu Gothic"/>
-                <w:b w:val="false"/>
-                <w:bCs w:val="false"/>
-                <w:sz w:val="21"/>
-                <w:szCs w:val="21"/>
-              </w:rPr>
-              <w:t xml:space="preserve"/>
-            </w:r>
-          </w:p>
-        </w:tc>
-        <w:tc>
-          <w:tcPr>
-            <w:tcW w:type="dxa" w:w="1000"/>
-            <w:tcBorders>
-              <w:top w:val="single" w:color="000000" w:sz="4"/>
-              <w:left w:val="single" w:color="000000" w:sz="4"/>
-              <w:bottom w:val="single" w:color="000000" w:sz="4"/>
-              <w:right w:val="single" w:color="000000" w:sz="4"/>
-            </w:tcBorders>
-            <w:tcMar>
-              <w:top w:type="dxa" w:w="80"/>
-              <w:left w:type="dxa" w:w="120"/>
-              <w:bottom w:type="dxa" w:w="80"/>
-              <w:right w:type="dxa" w:w="120"/>
-            </w:tcMar>
-            <w:vAlign w:val="center"/>
-          </w:tcPr>
-          <w:p>
-            <w:pPr>
-              <w:jc w:val="left"/>
-            </w:pPr>
-            <w:r>
-              <w:rPr>
-                <w:rFonts w:ascii="Yu Gothic" w:cs="Yu Gothic" w:eastAsia="Yu Gothic" w:hAnsi="Yu Gothic"/>
-                <w:b w:val="false"/>
-                <w:bCs w:val="false"/>
-                <w:sz w:val="21"/>
-                <w:szCs w:val="21"/>
-              </w:rPr>
-              <w:t xml:space="preserve"/>
-            </w:r>
-          </w:p>
-        </w:tc>
-        <w:tc>
-          <w:tcPr>
-            <w:tcW w:type="dxa" w:w="6826"/>
-            <w:tcBorders>
-              <w:top w:val="single" w:color="000000" w:sz="4"/>
-              <w:left w:val="single" w:color="000000" w:sz="4"/>
-              <w:bottom w:val="single" w:color="000000" w:sz="4"/>
-              <w:right w:val="single" w:color="000000" w:sz="4"/>
-            </w:tcBorders>
-            <w:tcMar>
-              <w:top w:type="dxa" w:w="80"/>
-              <w:left w:type="dxa" w:w="120"/>
-              <w:bottom w:type="dxa" w:w="80"/>
-              <w:right w:type="dxa" w:w="120"/>
-            </w:tcMar>
-            <w:vAlign w:val="center"/>
-          </w:tcPr>
-          <w:p>
-            <w:pPr>
+              <w:top w:type="dxa" w:w="20"/>
+              <w:left w:type="dxa" w:w="120"/>
+              <w:bottom w:type="dxa" w:w="20"/>
+              <w:right w:type="dxa" w:w="120"/>
+            </w:tcMar>
+            <w:vAlign w:val="center"/>
+          </w:tcPr>
+          <w:p>
+            <w:pPr>
+              <w:spacing w:line="180" w:lineRule="auto"/>
               <w:jc w:val="right"/>
             </w:pPr>
             <w:r>
@@ -2018,13 +1978,8 @@
       </w:tr>
     </w:tbl>
     <w:p>
-      <w:r>
-        <w:br w:type="page"/>
-      </w:r>
-    </w:p>
-    <w:p>
       <w:pPr>
-        <w:spacing w:after="100" w:before="0"/>
+        <w:spacing w:after="20" w:before="0" w:line="180" w:lineRule="auto"/>
       </w:pPr>
       <w:r>
         <w:rPr>
@@ -2066,15 +2021,16 @@
             </w:tcBorders>
             <w:shd w:fill="EEEEEE" w:val="clear"/>
             <w:tcMar>
-              <w:top w:type="dxa" w:w="80"/>
-              <w:left w:type="dxa" w:w="120"/>
-              <w:bottom w:type="dxa" w:w="80"/>
-              <w:right w:type="dxa" w:w="120"/>
-            </w:tcMar>
-            <w:vAlign w:val="center"/>
-          </w:tcPr>
-          <w:p>
-            <w:pPr>
+              <w:top w:type="dxa" w:w="20"/>
+              <w:left w:type="dxa" w:w="120"/>
+              <w:bottom w:type="dxa" w:w="20"/>
+              <w:right w:type="dxa" w:w="120"/>
+            </w:tcMar>
+            <w:vAlign w:val="center"/>
+          </w:tcPr>
+          <w:p>
+            <w:pPr>
+              <w:spacing w:line="180" w:lineRule="auto"/>
               <w:jc w:val="center"/>
             </w:pPr>
             <w:r>
@@ -2100,15 +2056,16 @@
             </w:tcBorders>
             <w:shd w:fill="EEEEEE" w:val="clear"/>
             <w:tcMar>
-              <w:top w:type="dxa" w:w="80"/>
-              <w:left w:type="dxa" w:w="120"/>
-              <w:bottom w:type="dxa" w:w="80"/>
-              <w:right w:type="dxa" w:w="120"/>
-            </w:tcMar>
-            <w:vAlign w:val="center"/>
-          </w:tcPr>
-          <w:p>
-            <w:pPr>
+              <w:top w:type="dxa" w:w="20"/>
+              <w:left w:type="dxa" w:w="120"/>
+              <w:bottom w:type="dxa" w:w="20"/>
+              <w:right w:type="dxa" w:w="120"/>
+            </w:tcMar>
+            <w:vAlign w:val="center"/>
+          </w:tcPr>
+          <w:p>
+            <w:pPr>
+              <w:spacing w:line="180" w:lineRule="auto"/>
               <w:jc w:val="center"/>
             </w:pPr>
             <w:r>
@@ -2134,15 +2091,16 @@
             </w:tcBorders>
             <w:shd w:fill="EEEEEE" w:val="clear"/>
             <w:tcMar>
-              <w:top w:type="dxa" w:w="80"/>
-              <w:left w:type="dxa" w:w="120"/>
-              <w:bottom w:type="dxa" w:w="80"/>
-              <w:right w:type="dxa" w:w="120"/>
-            </w:tcMar>
-            <w:vAlign w:val="center"/>
-          </w:tcPr>
-          <w:p>
-            <w:pPr>
+              <w:top w:type="dxa" w:w="20"/>
+              <w:left w:type="dxa" w:w="120"/>
+              <w:bottom w:type="dxa" w:w="20"/>
+              <w:right w:type="dxa" w:w="120"/>
+            </w:tcMar>
+            <w:vAlign w:val="center"/>
+          </w:tcPr>
+          <w:p>
+            <w:pPr>
+              <w:spacing w:line="180" w:lineRule="auto"/>
               <w:jc w:val="left"/>
             </w:pPr>
             <w:r>
@@ -2169,15 +2127,16 @@
               <w:right w:val="single" w:color="000000" w:sz="4"/>
             </w:tcBorders>
             <w:tcMar>
-              <w:top w:type="dxa" w:w="80"/>
-              <w:left w:type="dxa" w:w="120"/>
-              <w:bottom w:type="dxa" w:w="80"/>
-              <w:right w:type="dxa" w:w="120"/>
-            </w:tcMar>
-            <w:vAlign w:val="center"/>
-          </w:tcPr>
-          <w:p>
-            <w:pPr>
+              <w:top w:type="dxa" w:w="20"/>
+              <w:left w:type="dxa" w:w="120"/>
+              <w:bottom w:type="dxa" w:w="20"/>
+              <w:right w:type="dxa" w:w="120"/>
+            </w:tcMar>
+            <w:vAlign w:val="center"/>
+          </w:tcPr>
+          <w:p>
+            <w:pPr>
+              <w:spacing w:line="180" w:lineRule="auto"/>
               <w:jc w:val="left"/>
             </w:pPr>
             <w:r>
@@ -2202,15 +2161,16 @@
               <w:right w:val="single" w:color="000000" w:sz="4"/>
             </w:tcBorders>
             <w:tcMar>
-              <w:top w:type="dxa" w:w="80"/>
-              <w:left w:type="dxa" w:w="120"/>
-              <w:bottom w:type="dxa" w:w="80"/>
-              <w:right w:type="dxa" w:w="120"/>
-            </w:tcMar>
-            <w:vAlign w:val="center"/>
-          </w:tcPr>
-          <w:p>
-            <w:pPr>
+              <w:top w:type="dxa" w:w="20"/>
+              <w:left w:type="dxa" w:w="120"/>
+              <w:bottom w:type="dxa" w:w="20"/>
+              <w:right w:type="dxa" w:w="120"/>
+            </w:tcMar>
+            <w:vAlign w:val="center"/>
+          </w:tcPr>
+          <w:p>
+            <w:pPr>
+              <w:spacing w:line="180" w:lineRule="auto"/>
               <w:jc w:val="left"/>
             </w:pPr>
             <w:r>
@@ -2235,15 +2195,16 @@
               <w:right w:val="single" w:color="000000" w:sz="4"/>
             </w:tcBorders>
             <w:tcMar>
-              <w:top w:type="dxa" w:w="80"/>
-              <w:left w:type="dxa" w:w="120"/>
-              <w:bottom w:type="dxa" w:w="80"/>
-              <w:right w:type="dxa" w:w="120"/>
-            </w:tcMar>
-            <w:vAlign w:val="center"/>
-          </w:tcPr>
-          <w:p>
-            <w:pPr>
+              <w:top w:type="dxa" w:w="20"/>
+              <w:left w:type="dxa" w:w="120"/>
+              <w:bottom w:type="dxa" w:w="20"/>
+              <w:right w:type="dxa" w:w="120"/>
+            </w:tcMar>
+            <w:vAlign w:val="center"/>
+          </w:tcPr>
+          <w:p>
+            <w:pPr>
+              <w:spacing w:line="180" w:lineRule="auto"/>
               <w:jc w:val="left"/>
             </w:pPr>
             <w:r>
@@ -2262,7 +2223,7 @@
     </w:tbl>
     <w:p>
       <w:pPr>
-        <w:spacing w:after="100" w:before="300"/>
+        <w:spacing w:after="20" w:before="60" w:line="180" w:lineRule="auto"/>
       </w:pPr>
       <w:r>
         <w:rPr>
@@ -2301,14 +2262,17 @@
               <w:right w:val="single" w:color="000000" w:sz="4"/>
             </w:tcBorders>
             <w:tcMar>
-              <w:top w:type="dxa" w:w="80"/>
-              <w:left w:type="dxa" w:w="120"/>
-              <w:bottom w:type="dxa" w:w="80"/>
-              <w:right w:type="dxa" w:w="120"/>
-            </w:tcMar>
-            <w:vAlign w:val="center"/>
-          </w:tcPr>
-          <w:p>
+              <w:top w:type="dxa" w:w="20"/>
+              <w:left w:type="dxa" w:w="120"/>
+              <w:bottom w:type="dxa" w:w="20"/>
+              <w:right w:type="dxa" w:w="120"/>
+            </w:tcMar>
+            <w:vAlign w:val="center"/>
+          </w:tcPr>
+          <w:p>
+            <w:pPr>
+              <w:spacing w:line="180" w:lineRule="auto"/>
+            </w:pPr>
             <w:r>
               <w:rPr>
                 <w:rFonts w:ascii="Yu Gothic" w:cs="Yu Gothic" w:eastAsia="Yu Gothic" w:hAnsi="Yu Gothic"/>
@@ -2319,6 +2283,9 @@
             </w:r>
           </w:p>
           <w:p>
+            <w:pPr>
+              <w:spacing w:line="180" w:lineRule="auto"/>
+            </w:pPr>
             <w:r>
               <w:rPr>
                 <w:rFonts w:ascii="Yu Gothic" w:cs="Yu Gothic" w:eastAsia="Yu Gothic" w:hAnsi="Yu Gothic"/>
@@ -2329,6 +2296,9 @@
             </w:r>
           </w:p>
           <w:p>
+            <w:pPr>
+              <w:spacing w:line="180" w:lineRule="auto"/>
+            </w:pPr>
             <w:r>
               <w:rPr>
                 <w:rFonts w:ascii="Yu Gothic" w:cs="Yu Gothic" w:eastAsia="Yu Gothic" w:hAnsi="Yu Gothic"/>
@@ -2343,7 +2313,7 @@
     </w:tbl>
     <w:sectPr>
       <w:pgSz w:w="11906" w:h="16838" w:orient="portrait"/>
-      <w:pgMar w:top="1000" w:right="1440" w:bottom="1000" w:left="1440" w:header="708" w:footer="708" w:gutter="0"/>
+      <w:pgMar w:top="400" w:right="1440" w:bottom="400" w:left="1440" w:header="708" w:footer="708" w:gutter="0"/>
       <w:pgNumType/>
       <w:docGrid w:linePitch="360"/>
     </w:sectPr>

</xml_diff>

<commit_message>
Embed the ID photo in the rirekisho
The rirekisho had an empty photo box with print-and-paste instructions, which
is incomplete for a document Japanese employers expect a photo on. The photo
is now embedded at 2.9 x 3.87cm (3:4), and the "print this out and glue a
photo in the box" note is removed since it no longer applies.

Required adding the media part, an image relationship, and the drawing and
wordprocessingDrawing namespaces, none of which the file had before.

The source photo also had noticeably red sclera. Corrected with a mask
covering only the visible white of each eye, red channel only. Eyelids,
lashes, iris and skin are pixel-identical to the original.

Co-Authored-By: Claude Opus 5 <noreply@anthropic.com>
</commit_message>
<xml_diff>
--- a/public/resume/rirekisho.docx
+++ b/public/resume/rirekisho.docx
@@ -1,6 +1,6 @@
 
 <file path=word/document.xml><?xml version="1.0" encoding="utf-8"?>
-<w:document xmlns:ns1="http://schemas.openxmlformats.org/markup-compatibility/2006" xmlns:w="http://schemas.openxmlformats.org/wordprocessingml/2006/main" xmlns:w14="http://schemas.microsoft.com/office/word/2010/wordml" xmlns:w15="http://schemas.microsoft.com/office/word/2012/wordml" xmlns:wp14="http://schemas.microsoft.com/office/word/2010/wordprocessingDrawing" ns1:Ignorable="w14 w15 wp14">
+<w:document xmlns:ns1="http://schemas.openxmlformats.org/markup-compatibility/2006" xmlns:w="http://schemas.openxmlformats.org/wordprocessingml/2006/main" xmlns:w14="http://schemas.microsoft.com/office/word/2010/wordml" xmlns:w15="http://schemas.microsoft.com/office/word/2012/wordml" xmlns:wp14="http://schemas.microsoft.com/office/word/2010/wordprocessingDrawing" xmlns:r="http://schemas.openxmlformats.org/officeDocument/2006/relationships" xmlns:wp="http://schemas.openxmlformats.org/drawingml/2006/wordprocessingDrawing" ns1:Ignorable="w14 w15 wp14">
   <w:body>
     <w:p>
       <w:pPr>
@@ -141,44 +141,45 @@
           </w:tcPr>
           <w:p>
             <w:pPr>
-              <w:spacing w:before="40" w:line="180" w:lineRule="auto"/>
+              <w:spacing w:line="240" w:lineRule="auto"/>
               <w:jc w:val="center"/>
             </w:pPr>
             <w:r>
-              <w:rPr>
-                <w:rFonts w:ascii="Yu Gothic" w:cs="Yu Gothic" w:eastAsia="Yu Gothic" w:hAnsi="Yu Gothic"/>
-                <w:sz w:val="18"/>
-                <w:szCs w:val="18"/>
-              </w:rPr>
-              <w:t xml:space="preserve">写真</w:t>
-            </w:r>
-          </w:p>
-          <w:p>
-            <w:pPr>
-              <w:spacing w:line="180" w:lineRule="auto"/>
-              <w:jc w:val="center"/>
-            </w:pPr>
-            <w:r>
-              <w:rPr>
-                <w:rFonts w:ascii="Yu Gothic" w:cs="Yu Gothic" w:eastAsia="Yu Gothic" w:hAnsi="Yu Gothic"/>
-                <w:sz w:val="14"/>
-                <w:szCs w:val="14"/>
-              </w:rPr>
-              <w:t xml:space="preserve">タテ4cm×ヨコ3cm</w:t>
-            </w:r>
-          </w:p>
-          <w:p>
-            <w:pPr>
-              <w:spacing w:line="180" w:lineRule="auto"/>
-              <w:jc w:val="center"/>
-            </w:pPr>
-            <w:r>
-              <w:rPr>
-                <w:rFonts w:ascii="Yu Gothic" w:cs="Yu Gothic" w:eastAsia="Yu Gothic" w:hAnsi="Yu Gothic"/>
-                <w:sz w:val="14"/>
-                <w:szCs w:val="14"/>
-              </w:rPr>
-              <w:t xml:space="preserve">貼付</w:t>
+              <w:drawing>
+                <wp:inline distT="0" distB="0" distL="0" distR="0">
+                  <wp:extent cx="1044000" cy="1392000"/>
+                  <wp:effectExtent l="0" t="0" r="0" b="0"/>
+                  <wp:docPr id="900" name="photo"/>
+                  <wp:cNvGraphicFramePr>
+                    <a:graphicFrameLocks xmlns:a="http://schemas.openxmlformats.org/drawingml/2006/main" noChangeAspect="1"/>
+                  </wp:cNvGraphicFramePr>
+                  <a:graphic xmlns:a="http://schemas.openxmlformats.org/drawingml/2006/main">
+                    <a:graphicData uri="http://schemas.openxmlformats.org/drawingml/2006/picture">
+                      <pic:pic xmlns:pic="http://schemas.openxmlformats.org/drawingml/2006/picture">
+                        <pic:nvPicPr>
+                          <pic:cNvPr id="900" name="photo"/>
+                          <pic:cNvPicPr/>
+                        </pic:nvPicPr>
+                        <pic:blipFill>
+                          <a:blip r:embed="rIdPhoto"/>
+                          <a:stretch>
+                            <a:fillRect/>
+                          </a:stretch>
+                        </pic:blipFill>
+                        <pic:spPr>
+                          <a:xfrm>
+                            <a:off x="0" y="0"/>
+                            <a:ext cx="1044000" cy="1392000"/>
+                          </a:xfrm>
+                          <a:prstGeom prst="rect">
+                            <a:avLst/>
+                          </a:prstGeom>
+                        </pic:spPr>
+                      </pic:pic>
+                    </a:graphicData>
+                  </a:graphic>
+                </wp:inline>
+              </w:drawing>
             </w:r>
           </w:p>
         </w:tc>
@@ -588,7 +589,7 @@
           <w:sz w:val="16"/>
           <w:szCs w:val="16"/>
         </w:rPr>
-        <w:t xml:space="preserve">※印刷後、上の枠内に証明写真（3ヶ月以内撮影・正面上半身）を貼付してください。</w:t>
+        <w:t xml:space="preserve"/>
       </w:r>
     </w:p>
     <w:p>

</xml_diff>